<commit_message>
MRP guidelines: source floor, and a required table of contents
</commit_message>
<xml_diff>
--- a/week-11-launch-and-topic/Multimodal Research Project TCE 284.docx
+++ b/week-11-launch-and-topic/Multimodal Research Project TCE 284.docx
@@ -828,7 +828,7 @@
           <w:sz w:val="22"/>
           <w:szCs w:val="22"/>
         </w:rPr>
-        <w:t>Works Cited</w:t>
+        <w:t xml:space="preserve">Works Cited. At least one book, at least one peer-reviewed journal article, and one primary source you gathered yourself: an interview, an observation, a document. Everything else counts on top of that floor, not toward it.</w:t>
       </w:r>
     </w:p>
     <w:p/>
@@ -932,7 +932,7 @@
           <w:sz w:val="22"/>
           <w:szCs w:val="22"/>
         </w:rPr>
-        <w:t xml:space="preserve"> including an optional table of contents with page numbers for each required element, your AI-generated artifact, and your reflective note.</w:t>
+        <w:t xml:space="preserve"> including a table of contents giving the page number for each of the eight required elements, your AI-generated artifact, and your reflective note.</w:t>
       </w:r>
     </w:p>
     <w:p>

</xml_diff>